<commit_message>
updated readme with presenter instructions
</commit_message>
<xml_diff>
--- a/Brightcon2026_DemoDerby_Template.docx
+++ b/Brightcon2026_DemoDerby_Template.docx
@@ -1,101 +1,16 @@
 
 <file path=word/document.xml><?xml version="1.0" encoding="utf-8"?>
-<w:document xmlns:wpc="http://schemas.microsoft.com/office/word/2010/wordprocessingCanvas" xmlns:cx="http://schemas.microsoft.com/office/drawing/2014/chartex" xmlns:cx1="http://schemas.microsoft.com/office/drawing/2015/9/8/chartex" xmlns:cx2="http://schemas.microsoft.com/office/drawing/2015/10/21/chartex" xmlns:cx3="http://schemas.microsoft.com/office/drawing/2016/5/9/chartex" xmlns:cx4="http://schemas.microsoft.com/office/drawing/2016/5/10/chartex" xmlns:cx5="http://schemas.microsoft.com/office/drawing/2016/5/11/chartex" xmlns:cx6="http://schemas.microsoft.com/office/drawing/2016/5/12/chartex" xmlns:cx7="http://schemas.microsoft.com/office/drawing/2016/5/13/chartex" xmlns:cx8="http://schemas.microsoft.com/office/drawing/2016/5/14/chartex" xmlns:mc="http://schemas.openxmlformats.org/markup-compatibility/2006" xmlns:aink="http://schemas.microsoft.com/office/drawing/2016/ink" xmlns:am3d="http://schemas.microsoft.com/office/drawing/2017/model3d" xmlns:o="urn:schemas-microsoft-com:office:office" xmlns:oel="http://schemas.microsoft.com/office/2019/extlst" xmlns:r="http://schemas.openxmlformats.org/officeDocument/2006/relationships" xmlns:m="http://schemas.openxmlformats.org/officeDocument/2006/math" xmlns:v="urn:schemas-microsoft-com:vml" xmlns:wp14="http://schemas.microsoft.com/office/word/2010/wordprocessingDrawing" xmlns:wp="http://schemas.openxmlformats.org/drawingml/2006/wordprocessingDrawing" xmlns:w10="urn:schemas-microsoft-com:office:word" xmlns:w="http://schemas.openxmlformats.org/wordprocessingml/2006/main" xmlns:w14="http://schemas.microsoft.com/office/word/2010/wordml" xmlns:w15="http://schemas.microsoft.com/office/word/2012/wordml" xmlns:w16cex="http://schemas.microsoft.com/office/word/2018/wordml/cex" xmlns:w16cid="http://schemas.microsoft.com/office/word/2016/wordml/cid" xmlns:w16="http://schemas.microsoft.com/office/word/2018/wordml" xmlns:w16du="http://schemas.microsoft.com/office/word/2023/wordml/word16du" xmlns:w16sdtdh="http://schemas.microsoft.com/office/word/2020/wordml/sdtdatahash" xmlns:w16sdtfl="http://schemas.microsoft.com/office/word/2024/wordml/sdtformatlock" xmlns:w16se="http://schemas.microsoft.com/office/word/2015/wordml/symex" xmlns:wpg="http://schemas.microsoft.com/office/word/2010/wordprocessingGroup" xmlns:wpi="http://schemas.microsoft.com/office/word/2010/wordprocessingInk" xmlns:wne="http://schemas.microsoft.com/office/word/2006/wordml" xmlns:wps="http://schemas.microsoft.com/office/word/2010/wordprocessingShape" mc:Ignorable="w14 w15 w16se w16cid w16 w16cex w16sdtdh w16sdtfl w16du wp14">
+<w:document xmlns:wpc="http://schemas.microsoft.com/office/word/2010/wordprocessingCanvas" xmlns:cx="http://schemas.microsoft.com/office/drawing/2014/chartex" xmlns:cx1="http://schemas.microsoft.com/office/drawing/2015/9/8/chartex" xmlns:cx2="http://schemas.microsoft.com/office/drawing/2015/10/21/chartex" xmlns:cx3="http://schemas.microsoft.com/office/drawing/2016/5/9/chartex" xmlns:cx4="http://schemas.microsoft.com/office/drawing/2016/5/10/chartex" xmlns:cx5="http://schemas.microsoft.com/office/drawing/2016/5/11/chartex" xmlns:cx6="http://schemas.microsoft.com/office/drawing/2016/5/12/chartex" xmlns:cx7="http://schemas.microsoft.com/office/drawing/2016/5/13/chartex" xmlns:cx8="http://schemas.microsoft.com/office/drawing/2016/5/14/chartex" xmlns:mc="http://schemas.openxmlformats.org/markup-compatibility/2006" xmlns:m="http://schemas.openxmlformats.org/officeDocument/2006/math" xmlns:aink="http://schemas.microsoft.com/office/drawing/2016/ink" xmlns:am3d="http://schemas.microsoft.com/office/drawing/2017/model3d" xmlns:oel="http://schemas.microsoft.com/office/2019/extlst" xmlns:r="http://schemas.openxmlformats.org/officeDocument/2006/relationships" xmlns:wp14="http://schemas.microsoft.com/office/word/2010/wordprocessingDrawing" xmlns:wp="http://schemas.openxmlformats.org/drawingml/2006/wordprocessingDrawing" xmlns:wpg="http://schemas.microsoft.com/office/word/2010/wordprocessingGroup" xmlns:wpi="http://schemas.microsoft.com/office/word/2010/wordprocessingInk" xmlns:wps="http://schemas.microsoft.com/office/word/2010/wordprocessingShape" xmlns:o="urn:schemas-microsoft-com:office:office" xmlns:v="urn:schemas-microsoft-com:vml" xmlns:w10="urn:schemas-microsoft-com:office:word" xmlns:w="http://schemas.openxmlformats.org/wordprocessingml/2006/main" xmlns:w14="http://schemas.microsoft.com/office/word/2010/wordml" xmlns:w15="http://schemas.microsoft.com/office/word/2012/wordml" xmlns:w16cex="http://schemas.microsoft.com/office/word/2018/wordml/cex" xmlns:w16cid="http://schemas.microsoft.com/office/word/2016/wordml/cid" xmlns:w16="http://schemas.microsoft.com/office/word/2018/wordml" xmlns:w16sdtdh="http://schemas.microsoft.com/office/word/2020/wordml/sdtdatahash" xmlns:w16sdtfl="http://schemas.microsoft.com/office/word/2024/wordml/sdtformatlock" xmlns:w16se="http://schemas.microsoft.com/office/word/2015/wordml/symex" xmlns:w16du="http://schemas.microsoft.com/office/word/2023/wordml/word16du" xmlns:wne="http://schemas.microsoft.com/office/word/2006/wordml" mc:Ignorable="w14 w15 w16se w16cid w16 w16cex w16sdtdh w16sdtfl w16du wp14">
   <w:body>
-    <w:tbl>
-      <w:tblPr>
-        <w:tblStyle w:val="TableGridLight"/>
-        <w:tblW w:w="0" w:type="auto"/>
-        <w:tblLook w:val="04A0" w:firstRow="1" w:lastRow="0" w:firstColumn="1" w:lastColumn="0" w:noHBand="0" w:noVBand="1"/>
-      </w:tblPr>
-      <w:tblGrid>
-        <w:gridCol w:w="2263"/>
-        <w:gridCol w:w="11684"/>
-        <w:gridCol w:w="6974"/>
-      </w:tblGrid>
-      <w:tr>
-        <w:tc>
-          <w:tcPr>
-            <w:tcW w:w="2263" w:type="dxa"/>
-          </w:tcPr>
-          <w:p>
-            <w:pPr>
-              <w:rPr>
-                <w:b/>
-                <w:bCs/>
-                <w:sz w:val="96"/>
-                <w:szCs w:val="96"/>
-              </w:rPr>
-            </w:pPr>
-            <w:r>
-              <w:rPr>
-                <w:b/>
-                <w:bCs/>
-                <w:sz w:val="96"/>
-                <w:szCs w:val="96"/>
-              </w:rPr>
-              <w:t>DDX</w:t>
-            </w:r>
-          </w:p>
-        </w:tc>
-        <w:tc>
-          <w:tcPr>
-            <w:tcW w:w="11684" w:type="dxa"/>
-          </w:tcPr>
-          <w:p>
-            <w:pPr>
-              <w:rPr>
-                <w:b/>
-                <w:bCs/>
-                <w:sz w:val="96"/>
-                <w:szCs w:val="96"/>
-              </w:rPr>
-            </w:pPr>
-            <w:r>
-              <w:rPr>
-                <w:b/>
-                <w:bCs/>
-                <w:sz w:val="96"/>
-                <w:szCs w:val="96"/>
-              </w:rPr>
-              <w:t>Title</w:t>
-            </w:r>
-          </w:p>
-        </w:tc>
-        <w:tc>
-          <w:tcPr>
-            <w:tcW w:w="6974" w:type="dxa"/>
-          </w:tcPr>
-          <w:p>
-            <w:pPr>
-              <w:rPr>
-                <w:b/>
-                <w:bCs/>
-                <w:sz w:val="96"/>
-                <w:szCs w:val="96"/>
-              </w:rPr>
-            </w:pPr>
-            <w:r>
-              <w:rPr>
-                <w:b/>
-                <w:bCs/>
-                <w:sz w:val="96"/>
-                <w:szCs w:val="96"/>
-              </w:rPr>
-              <w:t>Logo</w:t>
-            </w:r>
-          </w:p>
-        </w:tc>
-      </w:tr>
-    </w:tbl>
     <w:p>
       <w:pPr>
         <w:spacing w:before="240"/>
+        <w:jc w:val="right"/>
         <w:rPr>
-          <w:b/>
-          <w:bCs/>
-          <w:sz w:val="52"/>
-          <w:szCs w:val="52"/>
+          <w:i/>
+          <w:iCs/>
+          <w:sz w:val="28"/>
+          <w:szCs w:val="28"/>
           <w:lang w:val="en-US"/>
         </w:rPr>
       </w:pPr>
@@ -103,8 +18,71 @@
         <w:rPr>
           <w:i/>
           <w:iCs/>
+          <w:noProof/>
           <w:sz w:val="28"/>
           <w:szCs w:val="28"/>
+          <w:lang w:val="en-US"/>
+        </w:rPr>
+        <w:drawing>
+          <wp:inline distT="0" distB="0" distL="0" distR="0" wp14:anchorId="30C2BBB4" wp14:editId="48D8F3F6">
+            <wp:extent cx="2815407" cy="1316048"/>
+            <wp:effectExtent l="0" t="0" r="0" b="0"/>
+            <wp:docPr id="1204494831" name="Picture 1"/>
+            <wp:cNvGraphicFramePr>
+              <a:graphicFrameLocks xmlns:a="http://schemas.openxmlformats.org/drawingml/2006/main" noChangeAspect="1"/>
+            </wp:cNvGraphicFramePr>
+            <a:graphic xmlns:a="http://schemas.openxmlformats.org/drawingml/2006/main">
+              <a:graphicData uri="http://schemas.openxmlformats.org/drawingml/2006/picture">
+                <pic:pic xmlns:pic="http://schemas.openxmlformats.org/drawingml/2006/picture">
+                  <pic:nvPicPr>
+                    <pic:cNvPr id="1204494831" name="Picture 1204494831"/>
+                    <pic:cNvPicPr/>
+                  </pic:nvPicPr>
+                  <pic:blipFill>
+                    <a:blip r:embed="rId5" cstate="print">
+                      <a:extLst>
+                        <a:ext uri="{28A0092B-C50C-407E-A947-70E740481C1C}">
+                          <a14:useLocalDpi xmlns:a14="http://schemas.microsoft.com/office/drawing/2010/main" val="0"/>
+                        </a:ext>
+                      </a:extLst>
+                    </a:blip>
+                    <a:stretch>
+                      <a:fillRect/>
+                    </a:stretch>
+                  </pic:blipFill>
+                  <pic:spPr>
+                    <a:xfrm>
+                      <a:off x="0" y="0"/>
+                      <a:ext cx="2979923" cy="1392950"/>
+                    </a:xfrm>
+                    <a:prstGeom prst="rect">
+                      <a:avLst/>
+                    </a:prstGeom>
+                  </pic:spPr>
+                </pic:pic>
+              </a:graphicData>
+            </a:graphic>
+          </wp:inline>
+        </w:drawing>
+      </w:r>
+    </w:p>
+    <w:p>
+      <w:pPr>
+        <w:spacing w:before="240"/>
+        <w:rPr>
+          <w:b/>
+          <w:bCs/>
+          <w:sz w:val="48"/>
+          <w:szCs w:val="48"/>
+          <w:lang w:val="en-US"/>
+        </w:rPr>
+      </w:pPr>
+      <w:r>
+        <w:rPr>
+          <w:i/>
+          <w:iCs/>
+          <w:sz w:val="24"/>
+          <w:szCs w:val="24"/>
           <w:lang w:val="en-US"/>
         </w:rPr>
         <w:t>(One-</w:t>
@@ -114,8 +92,8 @@
         <w:rPr>
           <w:i/>
           <w:iCs/>
-          <w:sz w:val="28"/>
-          <w:szCs w:val="28"/>
+          <w:sz w:val="24"/>
+          <w:szCs w:val="24"/>
           <w:lang w:val="en-US"/>
         </w:rPr>
         <w:t>sentence  “</w:t>
@@ -125,41 +103,21 @@
         <w:rPr>
           <w:i/>
           <w:iCs/>
-          <w:sz w:val="28"/>
-          <w:szCs w:val="28"/>
+          <w:sz w:val="24"/>
+          <w:szCs w:val="24"/>
           <w:lang w:val="en-US"/>
         </w:rPr>
-        <w:t>what”)</w:t>
-      </w:r>
-      <w:r>
-        <w:rPr>
-          <w:i/>
-          <w:iCs/>
-          <w:sz w:val="28"/>
-          <w:szCs w:val="28"/>
-          <w:lang w:val="en-US"/>
-        </w:rPr>
-        <w:t xml:space="preserve">: </w:t>
+        <w:t xml:space="preserve">what”): </w:t>
       </w:r>
       <w:r>
         <w:rPr>
           <w:b/>
           <w:bCs/>
-          <w:sz w:val="52"/>
-          <w:szCs w:val="52"/>
+          <w:sz w:val="48"/>
+          <w:szCs w:val="48"/>
           <w:lang w:val="en-US"/>
         </w:rPr>
-        <w:t>This tool helps [who] t</w:t>
-      </w:r>
-      <w:r>
-        <w:rPr>
-          <w:b/>
-          <w:bCs/>
-          <w:sz w:val="52"/>
-          <w:szCs w:val="52"/>
-          <w:lang w:val="en-US"/>
-        </w:rPr>
-        <w:t xml:space="preserve">o [do what] without [pain it removes] </w:t>
+        <w:t xml:space="preserve">This tool helps [who] to [do what] without [pain it removes] </w:t>
       </w:r>
     </w:p>
     <w:p>
@@ -167,8 +125,8 @@
         <w:rPr>
           <w:b/>
           <w:bCs/>
-          <w:sz w:val="44"/>
-          <w:szCs w:val="44"/>
+          <w:sz w:val="40"/>
+          <w:szCs w:val="40"/>
           <w:lang w:val="en-US"/>
         </w:rPr>
       </w:pPr>
@@ -176,8 +134,8 @@
         <w:rPr>
           <w:i/>
           <w:iCs/>
-          <w:sz w:val="28"/>
-          <w:szCs w:val="28"/>
+          <w:sz w:val="24"/>
+          <w:szCs w:val="24"/>
           <w:lang w:val="en-US"/>
         </w:rPr>
         <w:t>Describe in more detail (3-5 sentences)</w:t>
@@ -186,8 +144,8 @@
         <w:rPr>
           <w:i/>
           <w:iCs/>
-          <w:sz w:val="28"/>
-          <w:szCs w:val="28"/>
+          <w:sz w:val="24"/>
+          <w:szCs w:val="24"/>
           <w:lang w:val="en-US"/>
         </w:rPr>
         <w:t xml:space="preserve"> </w:t>
@@ -196,8 +154,8 @@
         <w:rPr>
           <w:b/>
           <w:bCs/>
-          <w:sz w:val="44"/>
-          <w:szCs w:val="44"/>
+          <w:sz w:val="40"/>
+          <w:szCs w:val="40"/>
           <w:lang w:val="en-US"/>
         </w:rPr>
         <w:t>This is what my tool does, it does it this way, and it’s important</w:t>
@@ -206,8 +164,8 @@
         <w:rPr>
           <w:b/>
           <w:bCs/>
-          <w:sz w:val="44"/>
-          <w:szCs w:val="44"/>
+          <w:sz w:val="40"/>
+          <w:szCs w:val="40"/>
           <w:lang w:val="en-US"/>
         </w:rPr>
         <w:t>, and here’s what you can experience at my station!</w:t>
@@ -218,8 +176,8 @@
         <w:rPr>
           <w:b/>
           <w:bCs/>
-          <w:sz w:val="44"/>
-          <w:szCs w:val="44"/>
+          <w:sz w:val="40"/>
+          <w:szCs w:val="40"/>
           <w:lang w:val="en-US"/>
         </w:rPr>
       </w:pPr>
@@ -227,8 +185,8 @@
         <w:rPr>
           <w:b/>
           <w:bCs/>
-          <w:sz w:val="44"/>
-          <w:szCs w:val="44"/>
+          <w:sz w:val="40"/>
+          <w:szCs w:val="40"/>
           <w:lang w:val="en-US"/>
         </w:rPr>
         <w:t>…</w:t>
@@ -254,17 +212,17 @@
               <w:rPr>
                 <w:b/>
                 <w:bCs/>
-                <w:sz w:val="32"/>
-                <w:szCs w:val="32"/>
-                <w:lang w:val="en-US"/>
-              </w:rPr>
-            </w:pPr>
-            <w:r>
-              <w:rPr>
-                <w:b/>
-                <w:bCs/>
-                <w:sz w:val="32"/>
-                <w:szCs w:val="32"/>
+                <w:sz w:val="28"/>
+                <w:szCs w:val="28"/>
+                <w:lang w:val="en-US"/>
+              </w:rPr>
+            </w:pPr>
+            <w:r>
+              <w:rPr>
+                <w:b/>
+                <w:bCs/>
+                <w:sz w:val="28"/>
+                <w:szCs w:val="28"/>
                 <w:lang w:val="en-US"/>
               </w:rPr>
               <w:t>Where is the tool seated?</w:t>
@@ -275,8 +233,8 @@
               <w:rPr>
                 <w:b/>
                 <w:bCs/>
-                <w:sz w:val="32"/>
-                <w:szCs w:val="32"/>
+                <w:sz w:val="28"/>
+                <w:szCs w:val="28"/>
                 <w:lang w:val="en-US"/>
               </w:rPr>
             </w:pPr>
@@ -285,8 +243,8 @@
                 <w:rFonts w:ascii="Segoe UI Symbol" w:hAnsi="Segoe UI Symbol" w:cs="Segoe UI Symbol"/>
                 <w:b/>
                 <w:bCs/>
-                <w:sz w:val="32"/>
-                <w:szCs w:val="32"/>
+                <w:sz w:val="28"/>
+                <w:szCs w:val="28"/>
                 <w:lang w:val="en-US"/>
               </w:rPr>
               <w:t>☐</w:t>
@@ -295,8 +253,8 @@
               <w:rPr>
                 <w:b/>
                 <w:bCs/>
-                <w:sz w:val="32"/>
-                <w:szCs w:val="32"/>
+                <w:sz w:val="28"/>
+                <w:szCs w:val="28"/>
                 <w:lang w:val="en-US"/>
               </w:rPr>
               <w:t xml:space="preserve"> Data (new/improved inventory data)</w:t>
@@ -307,8 +265,8 @@
               <w:rPr>
                 <w:b/>
                 <w:bCs/>
-                <w:sz w:val="32"/>
-                <w:szCs w:val="32"/>
+                <w:sz w:val="28"/>
+                <w:szCs w:val="28"/>
                 <w:lang w:val="en-US"/>
               </w:rPr>
             </w:pPr>
@@ -317,8 +275,8 @@
                 <w:rFonts w:ascii="Segoe UI Symbol" w:hAnsi="Segoe UI Symbol" w:cs="Segoe UI Symbol"/>
                 <w:b/>
                 <w:bCs/>
-                <w:sz w:val="32"/>
-                <w:szCs w:val="32"/>
+                <w:sz w:val="28"/>
+                <w:szCs w:val="28"/>
                 <w:lang w:val="en-US"/>
               </w:rPr>
               <w:t>☐</w:t>
@@ -327,8 +285,8 @@
               <w:rPr>
                 <w:b/>
                 <w:bCs/>
-                <w:sz w:val="32"/>
-                <w:szCs w:val="32"/>
+                <w:sz w:val="28"/>
+                <w:szCs w:val="28"/>
                 <w:lang w:val="en-US"/>
               </w:rPr>
               <w:t xml:space="preserve"> Model (new computational framework or coupling)</w:t>
@@ -339,8 +297,8 @@
               <w:rPr>
                 <w:b/>
                 <w:bCs/>
-                <w:sz w:val="32"/>
-                <w:szCs w:val="32"/>
+                <w:sz w:val="28"/>
+                <w:szCs w:val="28"/>
                 <w:lang w:val="en-US"/>
               </w:rPr>
             </w:pPr>
@@ -349,8 +307,8 @@
                 <w:rFonts w:ascii="Segoe UI Symbol" w:hAnsi="Segoe UI Symbol" w:cs="Segoe UI Symbol"/>
                 <w:b/>
                 <w:bCs/>
-                <w:sz w:val="32"/>
-                <w:szCs w:val="32"/>
+                <w:sz w:val="28"/>
+                <w:szCs w:val="28"/>
                 <w:lang w:val="en-US"/>
               </w:rPr>
               <w:t>☐</w:t>
@@ -359,8 +317,8 @@
               <w:rPr>
                 <w:b/>
                 <w:bCs/>
-                <w:sz w:val="32"/>
-                <w:szCs w:val="32"/>
+                <w:sz w:val="28"/>
+                <w:szCs w:val="28"/>
                 <w:lang w:val="en-US"/>
               </w:rPr>
               <w:t xml:space="preserve"> AI usage (LLM / ML / agent in the workflow)</w:t>
@@ -371,8 +329,8 @@
               <w:rPr>
                 <w:b/>
                 <w:bCs/>
-                <w:sz w:val="32"/>
-                <w:szCs w:val="32"/>
+                <w:sz w:val="28"/>
+                <w:szCs w:val="28"/>
                 <w:lang w:val="en-US"/>
               </w:rPr>
             </w:pPr>
@@ -381,8 +339,8 @@
                 <w:rFonts w:ascii="Segoe UI Symbol" w:hAnsi="Segoe UI Symbol" w:cs="Segoe UI Symbol"/>
                 <w:b/>
                 <w:bCs/>
-                <w:sz w:val="32"/>
-                <w:szCs w:val="32"/>
+                <w:sz w:val="28"/>
+                <w:szCs w:val="28"/>
                 <w:lang w:val="en-US"/>
               </w:rPr>
               <w:t>☐</w:t>
@@ -391,8 +349,8 @@
               <w:rPr>
                 <w:b/>
                 <w:bCs/>
-                <w:sz w:val="32"/>
-                <w:szCs w:val="32"/>
+                <w:sz w:val="28"/>
+                <w:szCs w:val="28"/>
                 <w:lang w:val="en-US"/>
               </w:rPr>
               <w:t xml:space="preserve"> Linking systems (engineering ↔ LCA, ESM ↔ LCA, etc.)</w:t>
@@ -403,8 +361,8 @@
               <w:rPr>
                 <w:b/>
                 <w:bCs/>
-                <w:sz w:val="32"/>
-                <w:szCs w:val="32"/>
+                <w:sz w:val="28"/>
+                <w:szCs w:val="28"/>
                 <w:lang w:val="en-US"/>
               </w:rPr>
             </w:pPr>
@@ -413,8 +371,8 @@
                 <w:rFonts w:ascii="Segoe UI Symbol" w:hAnsi="Segoe UI Symbol" w:cs="Segoe UI Symbol"/>
                 <w:b/>
                 <w:bCs/>
-                <w:sz w:val="32"/>
-                <w:szCs w:val="32"/>
+                <w:sz w:val="28"/>
+                <w:szCs w:val="28"/>
                 <w:lang w:val="en-US"/>
               </w:rPr>
               <w:t>☐</w:t>
@@ -423,8 +381,8 @@
               <w:rPr>
                 <w:b/>
                 <w:bCs/>
-                <w:sz w:val="32"/>
-                <w:szCs w:val="32"/>
+                <w:sz w:val="28"/>
+                <w:szCs w:val="28"/>
                 <w:lang w:val="en-US"/>
               </w:rPr>
               <w:t xml:space="preserve"> Infrastructure / tooling (deployment, packaging, APIs)</w:t>
@@ -435,8 +393,8 @@
               <w:rPr>
                 <w:b/>
                 <w:bCs/>
-                <w:sz w:val="32"/>
-                <w:szCs w:val="32"/>
+                <w:sz w:val="28"/>
+                <w:szCs w:val="28"/>
                 <w:lang w:val="en-US"/>
               </w:rPr>
             </w:pPr>
@@ -446,17 +404,17 @@
               <w:rPr>
                 <w:i/>
                 <w:iCs/>
-                <w:sz w:val="32"/>
-                <w:szCs w:val="32"/>
-                <w:lang w:val="en-US"/>
-              </w:rPr>
-            </w:pPr>
-            <w:r>
-              <w:rPr>
-                <w:b/>
-                <w:bCs/>
-                <w:sz w:val="32"/>
-                <w:szCs w:val="32"/>
+                <w:sz w:val="28"/>
+                <w:szCs w:val="28"/>
+                <w:lang w:val="en-US"/>
+              </w:rPr>
+            </w:pPr>
+            <w:r>
+              <w:rPr>
+                <w:b/>
+                <w:bCs/>
+                <w:sz w:val="28"/>
+                <w:szCs w:val="28"/>
                 <w:lang w:val="en-US"/>
               </w:rPr>
               <w:t xml:space="preserve">Where is it located in the </w:t>
@@ -466,8 +424,8 @@
               <w:rPr>
                 <w:b/>
                 <w:bCs/>
-                <w:sz w:val="32"/>
-                <w:szCs w:val="32"/>
+                <w:sz w:val="28"/>
+                <w:szCs w:val="28"/>
                 <w:lang w:val="en-US"/>
               </w:rPr>
               <w:t>Brightway</w:t>
@@ -477,8 +435,8 @@
               <w:rPr>
                 <w:b/>
                 <w:bCs/>
-                <w:sz w:val="32"/>
-                <w:szCs w:val="32"/>
+                <w:sz w:val="28"/>
+                <w:szCs w:val="28"/>
                 <w:lang w:val="en-US"/>
               </w:rPr>
               <w:t xml:space="preserve">/LCA ecosystem, if at all: </w:t>
@@ -487,8 +445,8 @@
               <w:rPr>
                 <w:i/>
                 <w:iCs/>
-                <w:sz w:val="32"/>
-                <w:szCs w:val="32"/>
+                <w:sz w:val="28"/>
+                <w:szCs w:val="28"/>
                 <w:lang w:val="en-US"/>
               </w:rPr>
               <w:t xml:space="preserve">Name relevant related/parent tools explicitly, e.g. brightway2, premise, edges, </w:t>
@@ -498,8 +456,8 @@
               <w:rPr>
                 <w:i/>
                 <w:iCs/>
-                <w:sz w:val="32"/>
-                <w:szCs w:val="32"/>
+                <w:sz w:val="28"/>
+                <w:szCs w:val="28"/>
                 <w:lang w:val="en-US"/>
               </w:rPr>
               <w:t>timex</w:t>
@@ -509,8 +467,8 @@
               <w:rPr>
                 <w:i/>
                 <w:iCs/>
-                <w:sz w:val="32"/>
-                <w:szCs w:val="32"/>
+                <w:sz w:val="28"/>
+                <w:szCs w:val="28"/>
                 <w:lang w:val="en-US"/>
               </w:rPr>
               <w:t xml:space="preserve">, </w:t>
@@ -520,8 +478,8 @@
               <w:rPr>
                 <w:i/>
                 <w:iCs/>
-                <w:sz w:val="32"/>
-                <w:szCs w:val="32"/>
+                <w:sz w:val="28"/>
+                <w:szCs w:val="28"/>
                 <w:lang w:val="en-US"/>
               </w:rPr>
               <w:t>ecoinvent</w:t>
@@ -531,8 +489,8 @@
               <w:rPr>
                 <w:i/>
                 <w:iCs/>
-                <w:sz w:val="32"/>
-                <w:szCs w:val="32"/>
+                <w:sz w:val="28"/>
+                <w:szCs w:val="28"/>
                 <w:lang w:val="en-US"/>
               </w:rPr>
               <w:t>, bonsai, “standalone”</w:t>
@@ -543,19 +501,19 @@
               <w:rPr>
                 <w:b/>
                 <w:bCs/>
-                <w:sz w:val="32"/>
-                <w:szCs w:val="32"/>
-                <w:lang w:val="en-US"/>
-              </w:rPr>
-            </w:pPr>
-          </w:p>
-          <w:p>
-            <w:pPr>
-              <w:rPr>
-                <w:b/>
-                <w:bCs/>
-                <w:sz w:val="32"/>
-                <w:szCs w:val="32"/>
+                <w:sz w:val="28"/>
+                <w:szCs w:val="28"/>
+                <w:lang w:val="en-US"/>
+              </w:rPr>
+            </w:pPr>
+          </w:p>
+          <w:p>
+            <w:pPr>
+              <w:rPr>
+                <w:b/>
+                <w:bCs/>
+                <w:sz w:val="28"/>
+                <w:szCs w:val="28"/>
                 <w:lang w:val="en-US"/>
               </w:rPr>
             </w:pPr>
@@ -570,17 +528,17 @@
               <w:rPr>
                 <w:b/>
                 <w:bCs/>
-                <w:sz w:val="32"/>
-                <w:szCs w:val="32"/>
-                <w:lang w:val="en-US"/>
-              </w:rPr>
-            </w:pPr>
-            <w:r>
-              <w:rPr>
-                <w:b/>
-                <w:bCs/>
-                <w:sz w:val="32"/>
-                <w:szCs w:val="32"/>
+                <w:sz w:val="28"/>
+                <w:szCs w:val="28"/>
+                <w:lang w:val="en-US"/>
+              </w:rPr>
+            </w:pPr>
+            <w:r>
+              <w:rPr>
+                <w:b/>
+                <w:bCs/>
+                <w:sz w:val="28"/>
+                <w:szCs w:val="28"/>
                 <w:lang w:val="en-US"/>
               </w:rPr>
               <w:t xml:space="preserve">Development level: </w:t>
@@ -591,8 +549,8 @@
               <w:rPr>
                 <w:b/>
                 <w:bCs/>
-                <w:sz w:val="32"/>
-                <w:szCs w:val="32"/>
+                <w:sz w:val="28"/>
+                <w:szCs w:val="28"/>
                 <w:lang w:val="en-US"/>
               </w:rPr>
             </w:pPr>
@@ -602,8 +560,8 @@
                 <w:rFonts w:ascii="Segoe UI Symbol" w:hAnsi="Segoe UI Symbol" w:cs="Segoe UI Symbol"/>
                 <w:b/>
                 <w:bCs/>
-                <w:sz w:val="32"/>
-                <w:szCs w:val="32"/>
+                <w:sz w:val="28"/>
+                <w:szCs w:val="28"/>
                 <w:lang w:val="en-US"/>
               </w:rPr>
               <w:t>☐</w:t>
@@ -612,8 +570,8 @@
               <w:rPr>
                 <w:b/>
                 <w:bCs/>
-                <w:sz w:val="32"/>
-                <w:szCs w:val="32"/>
+                <w:sz w:val="28"/>
+                <w:szCs w:val="28"/>
                 <w:lang w:val="en-US"/>
               </w:rPr>
               <w:t xml:space="preserve">  </w:t>
@@ -622,8 +580,8 @@
               <w:rPr>
                 <w:b/>
                 <w:bCs/>
-                <w:sz w:val="32"/>
-                <w:szCs w:val="32"/>
+                <w:sz w:val="28"/>
+                <w:szCs w:val="28"/>
                 <w:lang w:val="en-US"/>
               </w:rPr>
               <w:t>Early</w:t>
@@ -633,8 +591,8 @@
               <w:rPr>
                 <w:b/>
                 <w:bCs/>
-                <w:sz w:val="32"/>
-                <w:szCs w:val="32"/>
+                <w:sz w:val="28"/>
+                <w:szCs w:val="28"/>
                 <w:lang w:val="en-US"/>
               </w:rPr>
               <w:t xml:space="preserve"> concept / prototype (not yet usable by others)</w:t>
@@ -645,8 +603,8 @@
               <w:rPr>
                 <w:b/>
                 <w:bCs/>
-                <w:sz w:val="32"/>
-                <w:szCs w:val="32"/>
+                <w:sz w:val="28"/>
+                <w:szCs w:val="28"/>
                 <w:lang w:val="en-US"/>
               </w:rPr>
             </w:pPr>
@@ -656,8 +614,8 @@
                 <w:rFonts w:ascii="Segoe UI Symbol" w:hAnsi="Segoe UI Symbol" w:cs="Segoe UI Symbol"/>
                 <w:b/>
                 <w:bCs/>
-                <w:sz w:val="32"/>
-                <w:szCs w:val="32"/>
+                <w:sz w:val="28"/>
+                <w:szCs w:val="28"/>
                 <w:lang w:val="en-US"/>
               </w:rPr>
               <w:t>☐</w:t>
@@ -666,8 +624,8 @@
               <w:rPr>
                 <w:b/>
                 <w:bCs/>
-                <w:sz w:val="32"/>
-                <w:szCs w:val="32"/>
+                <w:sz w:val="28"/>
+                <w:szCs w:val="28"/>
                 <w:lang w:val="en-US"/>
               </w:rPr>
               <w:t xml:space="preserve">  </w:t>
@@ -676,8 +634,8 @@
               <w:rPr>
                 <w:b/>
                 <w:bCs/>
-                <w:sz w:val="32"/>
-                <w:szCs w:val="32"/>
+                <w:sz w:val="28"/>
+                <w:szCs w:val="28"/>
                 <w:lang w:val="en-US"/>
               </w:rPr>
               <w:t>Beta</w:t>
@@ -687,8 +645,8 @@
               <w:rPr>
                 <w:b/>
                 <w:bCs/>
-                <w:sz w:val="32"/>
-                <w:szCs w:val="32"/>
+                <w:sz w:val="28"/>
+                <w:szCs w:val="28"/>
                 <w:lang w:val="en-US"/>
               </w:rPr>
               <w:t xml:space="preserve"> (usable with guidance, bugs expected)</w:t>
@@ -699,8 +657,8 @@
               <w:rPr>
                 <w:b/>
                 <w:bCs/>
-                <w:sz w:val="32"/>
-                <w:szCs w:val="32"/>
+                <w:sz w:val="28"/>
+                <w:szCs w:val="28"/>
                 <w:lang w:val="en-US"/>
               </w:rPr>
             </w:pPr>
@@ -710,8 +668,8 @@
                 <w:rFonts w:ascii="Segoe UI Symbol" w:hAnsi="Segoe UI Symbol" w:cs="Segoe UI Symbol"/>
                 <w:b/>
                 <w:bCs/>
-                <w:sz w:val="32"/>
-                <w:szCs w:val="32"/>
+                <w:sz w:val="28"/>
+                <w:szCs w:val="28"/>
                 <w:lang w:val="en-US"/>
               </w:rPr>
               <w:t>☐</w:t>
@@ -720,8 +678,8 @@
               <w:rPr>
                 <w:b/>
                 <w:bCs/>
-                <w:sz w:val="32"/>
-                <w:szCs w:val="32"/>
+                <w:sz w:val="28"/>
+                <w:szCs w:val="28"/>
                 <w:lang w:val="en-US"/>
               </w:rPr>
               <w:t xml:space="preserve">  </w:t>
@@ -730,8 +688,8 @@
               <w:rPr>
                 <w:b/>
                 <w:bCs/>
-                <w:sz w:val="32"/>
-                <w:szCs w:val="32"/>
+                <w:sz w:val="28"/>
+                <w:szCs w:val="28"/>
                 <w:lang w:val="en-US"/>
               </w:rPr>
               <w:t>Stable</w:t>
@@ -741,8 +699,8 @@
               <w:rPr>
                 <w:b/>
                 <w:bCs/>
-                <w:sz w:val="32"/>
-                <w:szCs w:val="32"/>
+                <w:sz w:val="28"/>
+                <w:szCs w:val="28"/>
                 <w:lang w:val="en-US"/>
               </w:rPr>
               <w:t xml:space="preserve"> release (documented, versioned, community-ready)</w:t>
@@ -753,28 +711,28 @@
               <w:rPr>
                 <w:b/>
                 <w:bCs/>
-                <w:sz w:val="32"/>
-                <w:szCs w:val="32"/>
-                <w:lang w:val="en-US"/>
-              </w:rPr>
-            </w:pPr>
-          </w:p>
-          <w:p>
-            <w:pPr>
-              <w:rPr>
-                <w:b/>
-                <w:bCs/>
-                <w:sz w:val="32"/>
-                <w:szCs w:val="32"/>
-                <w:lang w:val="en-US"/>
-              </w:rPr>
-            </w:pPr>
-            <w:r>
-              <w:rPr>
-                <w:b/>
-                <w:bCs/>
-                <w:sz w:val="32"/>
-                <w:szCs w:val="32"/>
+                <w:sz w:val="28"/>
+                <w:szCs w:val="28"/>
+                <w:lang w:val="en-US"/>
+              </w:rPr>
+            </w:pPr>
+          </w:p>
+          <w:p>
+            <w:pPr>
+              <w:rPr>
+                <w:b/>
+                <w:bCs/>
+                <w:sz w:val="28"/>
+                <w:szCs w:val="28"/>
+                <w:lang w:val="en-US"/>
+              </w:rPr>
+            </w:pPr>
+            <w:r>
+              <w:rPr>
+                <w:b/>
+                <w:bCs/>
+                <w:sz w:val="28"/>
+                <w:szCs w:val="28"/>
                 <w:lang w:val="en-US"/>
               </w:rPr>
               <w:t xml:space="preserve">Where you can help me: </w:t>
@@ -783,8 +741,8 @@
               <w:rPr>
                 <w:i/>
                 <w:iCs/>
-                <w:sz w:val="32"/>
-                <w:szCs w:val="32"/>
+                <w:sz w:val="28"/>
+                <w:szCs w:val="28"/>
                 <w:lang w:val="en-US"/>
               </w:rPr>
               <w:t>(State specific ask, not “feedback” – what kind of feedback? E.g. “Would you need /integrate this with your workflow”, “Do you have this methodological/data problem”)</w:t>
@@ -803,17 +761,17 @@
               <w:rPr>
                 <w:b/>
                 <w:bCs/>
-                <w:sz w:val="32"/>
-                <w:szCs w:val="32"/>
-                <w:lang w:val="en-US"/>
-              </w:rPr>
-            </w:pPr>
-            <w:r>
-              <w:rPr>
-                <w:b/>
-                <w:bCs/>
-                <w:sz w:val="32"/>
-                <w:szCs w:val="32"/>
+                <w:sz w:val="28"/>
+                <w:szCs w:val="28"/>
+                <w:lang w:val="en-US"/>
+              </w:rPr>
+            </w:pPr>
+            <w:r>
+              <w:rPr>
+                <w:b/>
+                <w:bCs/>
+                <w:sz w:val="28"/>
+                <w:szCs w:val="28"/>
                 <w:lang w:val="en-US"/>
               </w:rPr>
               <w:t xml:space="preserve">Technical / practical details: </w:t>
@@ -824,19 +782,19 @@
               <w:rPr>
                 <w:b/>
                 <w:bCs/>
-                <w:sz w:val="32"/>
-                <w:szCs w:val="32"/>
-                <w:lang w:val="en-US"/>
-              </w:rPr>
-            </w:pPr>
-          </w:p>
-          <w:p>
-            <w:pPr>
-              <w:rPr>
-                <w:b/>
-                <w:bCs/>
-                <w:sz w:val="32"/>
-                <w:szCs w:val="32"/>
+                <w:sz w:val="28"/>
+                <w:szCs w:val="28"/>
+                <w:lang w:val="en-US"/>
+              </w:rPr>
+            </w:pPr>
+          </w:p>
+          <w:p>
+            <w:pPr>
+              <w:rPr>
+                <w:b/>
+                <w:bCs/>
+                <w:sz w:val="28"/>
+                <w:szCs w:val="28"/>
                 <w:lang w:val="en-US"/>
               </w:rPr>
             </w:pPr>
@@ -853,17 +811,17 @@
               <w:rPr>
                 <w:b/>
                 <w:bCs/>
-                <w:sz w:val="32"/>
-                <w:szCs w:val="32"/>
-                <w:lang w:val="en-US"/>
-              </w:rPr>
-            </w:pPr>
-            <w:r>
-              <w:rPr>
-                <w:b/>
-                <w:bCs/>
-                <w:sz w:val="32"/>
-                <w:szCs w:val="32"/>
+                <w:sz w:val="28"/>
+                <w:szCs w:val="28"/>
+                <w:lang w:val="en-US"/>
+              </w:rPr>
+            </w:pPr>
+            <w:r>
+              <w:rPr>
+                <w:b/>
+                <w:bCs/>
+                <w:sz w:val="28"/>
+                <w:szCs w:val="28"/>
                 <w:lang w:val="en-US"/>
               </w:rPr>
               <w:t xml:space="preserve">License + access status: </w:t>
@@ -872,8 +830,8 @@
               <w:rPr>
                 <w:i/>
                 <w:iCs/>
-                <w:sz w:val="32"/>
-                <w:szCs w:val="32"/>
+                <w:sz w:val="28"/>
+                <w:szCs w:val="28"/>
                 <w:lang w:val="en-US"/>
               </w:rPr>
               <w:t>One line: open-source (MIT / Apache / GPL / other) or "open to collaborators" or "commercial".</w:t>
@@ -889,17 +847,17 @@
               <w:rPr>
                 <w:i/>
                 <w:iCs/>
-                <w:sz w:val="32"/>
-                <w:szCs w:val="32"/>
-                <w:lang w:val="en-US"/>
-              </w:rPr>
-            </w:pPr>
-            <w:r>
-              <w:rPr>
-                <w:b/>
-                <w:bCs/>
-                <w:sz w:val="32"/>
-                <w:szCs w:val="32"/>
+                <w:sz w:val="28"/>
+                <w:szCs w:val="28"/>
+                <w:lang w:val="en-US"/>
+              </w:rPr>
+            </w:pPr>
+            <w:r>
+              <w:rPr>
+                <w:b/>
+                <w:bCs/>
+                <w:sz w:val="28"/>
+                <w:szCs w:val="28"/>
                 <w:lang w:val="en-US"/>
               </w:rPr>
               <w:t xml:space="preserve">Link and QR code </w:t>
@@ -908,8 +866,8 @@
               <w:rPr>
                 <w:i/>
                 <w:iCs/>
-                <w:sz w:val="32"/>
-                <w:szCs w:val="32"/>
+                <w:sz w:val="28"/>
+                <w:szCs w:val="28"/>
                 <w:lang w:val="en-US"/>
               </w:rPr>
               <w:t>(to repo, tool, notebook)</w:t>
@@ -920,50 +878,50 @@
               <w:rPr>
                 <w:b/>
                 <w:bCs/>
-                <w:sz w:val="32"/>
-                <w:szCs w:val="32"/>
-                <w:lang w:val="en-US"/>
-              </w:rPr>
-            </w:pPr>
-          </w:p>
-          <w:p>
-            <w:pPr>
-              <w:rPr>
-                <w:b/>
-                <w:bCs/>
-                <w:sz w:val="32"/>
-                <w:szCs w:val="32"/>
-                <w:lang w:val="en-US"/>
-              </w:rPr>
-            </w:pPr>
-          </w:p>
-          <w:p>
-            <w:pPr>
-              <w:rPr>
-                <w:b/>
-                <w:bCs/>
-                <w:sz w:val="32"/>
-                <w:szCs w:val="32"/>
-                <w:lang w:val="en-US"/>
-              </w:rPr>
-            </w:pPr>
-          </w:p>
-          <w:p>
-            <w:pPr>
-              <w:rPr>
-                <w:b/>
-                <w:bCs/>
-                <w:sz w:val="32"/>
-                <w:szCs w:val="32"/>
-                <w:lang w:val="en-US"/>
-              </w:rPr>
-            </w:pPr>
-            <w:r>
-              <w:rPr>
-                <w:b/>
-                <w:bCs/>
-                <w:sz w:val="32"/>
-                <w:szCs w:val="32"/>
+                <w:sz w:val="28"/>
+                <w:szCs w:val="28"/>
+                <w:lang w:val="en-US"/>
+              </w:rPr>
+            </w:pPr>
+          </w:p>
+          <w:p>
+            <w:pPr>
+              <w:rPr>
+                <w:b/>
+                <w:bCs/>
+                <w:sz w:val="28"/>
+                <w:szCs w:val="28"/>
+                <w:lang w:val="en-US"/>
+              </w:rPr>
+            </w:pPr>
+          </w:p>
+          <w:p>
+            <w:pPr>
+              <w:rPr>
+                <w:b/>
+                <w:bCs/>
+                <w:sz w:val="28"/>
+                <w:szCs w:val="28"/>
+                <w:lang w:val="en-US"/>
+              </w:rPr>
+            </w:pPr>
+          </w:p>
+          <w:p>
+            <w:pPr>
+              <w:rPr>
+                <w:b/>
+                <w:bCs/>
+                <w:sz w:val="28"/>
+                <w:szCs w:val="28"/>
+                <w:lang w:val="en-US"/>
+              </w:rPr>
+            </w:pPr>
+            <w:r>
+              <w:rPr>
+                <w:b/>
+                <w:bCs/>
+                <w:sz w:val="28"/>
+                <w:szCs w:val="28"/>
                 <w:lang w:val="en-US"/>
               </w:rPr>
               <w:t>How to reach me</w:t>
@@ -972,8 +930,8 @@
               <w:rPr>
                 <w:b/>
                 <w:bCs/>
-                <w:sz w:val="32"/>
-                <w:szCs w:val="32"/>
+                <w:sz w:val="28"/>
+                <w:szCs w:val="28"/>
                 <w:lang w:val="en-US"/>
               </w:rPr>
               <w:t>/us</w:t>
@@ -982,8 +940,8 @@
               <w:rPr>
                 <w:b/>
                 <w:bCs/>
-                <w:sz w:val="32"/>
-                <w:szCs w:val="32"/>
+                <w:sz w:val="28"/>
+                <w:szCs w:val="28"/>
                 <w:lang w:val="en-US"/>
               </w:rPr>
               <w:t>: Lalala.forest@momo.com</w:t>
@@ -994,17 +952,17 @@
               <w:rPr>
                 <w:b/>
                 <w:bCs/>
-                <w:sz w:val="32"/>
-                <w:szCs w:val="32"/>
-                <w:lang w:val="en-US"/>
-              </w:rPr>
-            </w:pPr>
-            <w:r>
-              <w:rPr>
-                <w:b/>
-                <w:bCs/>
-                <w:sz w:val="32"/>
-                <w:szCs w:val="32"/>
+                <w:sz w:val="28"/>
+                <w:szCs w:val="28"/>
+                <w:lang w:val="en-US"/>
+              </w:rPr>
+            </w:pPr>
+            <w:r>
+              <w:rPr>
+                <w:b/>
+                <w:bCs/>
+                <w:sz w:val="28"/>
+                <w:szCs w:val="28"/>
                 <w:lang w:val="en-US"/>
               </w:rPr>
               <w:t>Lalala Forest, University of Mushrooms</w:t>
@@ -1015,8 +973,8 @@
               <w:rPr>
                 <w:b/>
                 <w:bCs/>
-                <w:sz w:val="32"/>
-                <w:szCs w:val="32"/>
+                <w:sz w:val="28"/>
+                <w:szCs w:val="28"/>
                 <w:lang w:val="en-US"/>
               </w:rPr>
             </w:pPr>
@@ -1042,7 +1000,7 @@
 </file>
 
 <file path=word/styles.xml><?xml version="1.0" encoding="utf-8"?>
-<w:styles xmlns:mc="http://schemas.openxmlformats.org/markup-compatibility/2006" xmlns:r="http://schemas.openxmlformats.org/officeDocument/2006/relationships" xmlns:w="http://schemas.openxmlformats.org/wordprocessingml/2006/main" xmlns:w14="http://schemas.microsoft.com/office/word/2010/wordml" xmlns:w15="http://schemas.microsoft.com/office/word/2012/wordml" xmlns:w16cex="http://schemas.microsoft.com/office/word/2018/wordml/cex" xmlns:w16cid="http://schemas.microsoft.com/office/word/2016/wordml/cid" xmlns:w16="http://schemas.microsoft.com/office/word/2018/wordml" xmlns:w16du="http://schemas.microsoft.com/office/word/2023/wordml/word16du" xmlns:w16sdtdh="http://schemas.microsoft.com/office/word/2020/wordml/sdtdatahash" xmlns:w16sdtfl="http://schemas.microsoft.com/office/word/2024/wordml/sdtformatlock" xmlns:w16se="http://schemas.microsoft.com/office/word/2015/wordml/symex" mc:Ignorable="w14 w15 w16se w16cid w16 w16cex w16sdtdh w16sdtfl w16du">
+<w:styles xmlns:mc="http://schemas.openxmlformats.org/markup-compatibility/2006" xmlns:r="http://schemas.openxmlformats.org/officeDocument/2006/relationships" xmlns:w="http://schemas.openxmlformats.org/wordprocessingml/2006/main" xmlns:w14="http://schemas.microsoft.com/office/word/2010/wordml" xmlns:w15="http://schemas.microsoft.com/office/word/2012/wordml" xmlns:w16cex="http://schemas.microsoft.com/office/word/2018/wordml/cex" xmlns:w16cid="http://schemas.microsoft.com/office/word/2016/wordml/cid" xmlns:w16="http://schemas.microsoft.com/office/word/2018/wordml" xmlns:w16sdtdh="http://schemas.microsoft.com/office/word/2020/wordml/sdtdatahash" xmlns:w16sdtfl="http://schemas.microsoft.com/office/word/2024/wordml/sdtformatlock" xmlns:w16se="http://schemas.microsoft.com/office/word/2015/wordml/symex" xmlns:w16du="http://schemas.microsoft.com/office/word/2023/wordml/word16du" mc:Ignorable="w14 w15 w16se w16cid w16 w16cex w16sdtdh w16sdtfl w16du">
   <w:docDefaults>
     <w:rPrDefault>
       <w:rPr>

</xml_diff>